<commit_message>
version 1.1.23 - Confirma responsável e explicita rejeição de cookies
Consolida as alterações entregues nesta versão, preservando integralmente seus arquivos.
Snapshot original: fb59a447b6e7fbe5976beafbd7dcc182e0f8f5a3. Histórico detalhado preservado em backup/main-antes-reorganizacao-2026-10-24.
</commit_message>
<xml_diff>
--- a/docs/juridico/Arcadia_documentos_legais_para_revisao.docx
+++ b/docs/juridico/Arcadia_documentos_legais_para_revisao.docx
@@ -38,7 +38,7 @@
     </w:p>
     <w:p>
       <w:r>
-        <w:t>Responsável provisório: Luciano Seabra Barata, pessoa física. A definição será discutida com a equipe.</w:t>
+        <w:t>Responsável: Luciano Seabra Barata, pessoa física.</w:t>
       </w:r>
     </w:p>
     <w:p>
@@ -149,7 +149,7 @@
     <w:p>
       <w:pPr/>
       <w:r>
-        <w:t>O Arcádia reúne informações e recursos de organização acadêmica, incluindo avisos, notícias, projetos, calendário, documentos e ferramentas pessoais. Sua apresentação como projeto acadêmico não o torna um canal oficial de decisões institucionais. O responsável provisório é Luciano Seabra Barata , mantenedor do portal, pessoa física. Essa definição será revisada com a equipe.</w:t>
+        <w:t xml:space="preserve">O Arcádia reúne informações e recursos de organização acadêmica, incluindo avisos, notícias, projetos, calendário, documentos e ferramentas pessoais. Sua apresentação como projeto acadêmico não o torna um canal oficial de decisões institucionais. O responsável é Luciano Seabra Barata , mantenedor do portal, pessoa física. </w:t>
       </w:r>
     </w:p>
     <w:p>
@@ -367,7 +367,7 @@
     <w:p>
       <w:pPr/>
       <w:r>
-        <w:t>O Arcádia é apresentado como projeto acadêmico de Desenvolvimento de Sistemas ligado ao contexto do IFPA Campus Belém. O responsável provisório pelo portal e pelo tratamento dos dados é Luciano Seabra Barata , mantenedor do portal, pessoa física. Essa indicação será revisada com a equipe. A referência acadêmica não atribui, por si só, essa responsabilidade ao IFPA.</w:t>
+        <w:t>O Arcádia é apresentado como projeto acadêmico de Desenvolvimento de Sistemas ligado ao contexto do IFPA Campus Belém. O responsável pelo portal e pelo tratamento dos dados é Luciano Seabra Barata , mantenedor do portal, pessoa física.  A referência acadêmica não atribui, por si só, essa responsabilidade ao IFPA.</w:t>
       </w:r>
     </w:p>
     <w:p>
@@ -611,7 +611,7 @@
     </w:p>
     <w:p>
       <w:r>
-        <w:t>Proposta para revisão jurídica • versão 1.0 • sem entrada em vigor definida</w:t>
+        <w:t>Proposta para revisão jurídica • versão 1.1 • sem entrada em vigor definida</w:t>
       </w:r>
     </w:p>
     <w:p>
@@ -624,7 +624,7 @@
     </w:p>
     <w:p>
       <w:r>
-        <w:t>Esta política explica como o Arcádia utiliza recursos do navegador para manter sessões, lembrar preferências e disponibilizar arquivos da interface sem conexão. Ela complementa a Política de Privacidade. O responsável provisório informado é Luciano Seabra Barata e o contato é portalarcadia.contato@gmail.com.</w:t>
+        <w:t>Esta política explica como o Arcádia utiliza recursos do navegador para manter sessões, lembrar preferências e disponibilizar arquivos da interface sem conexão. Ela complementa a Política de Privacidade. O responsável informado é Luciano Seabra Barata e o contato é portalarcadia.contato@gmail.com.</w:t>
       </w:r>
     </w:p>
     <w:p>
@@ -678,7 +678,7 @@
     </w:p>
     <w:p>
       <w:r>
-        <w:t>O aviso oferece Usar apenas necessários e Aceitar opcionais com destaque equivalente. Não há cookies opcionais ativos nesta versão. Guardamos a escolha e sua data neste navegador, até remoção dos dados ou atualização da versão do aviso. Você pode alterar a escolha em Preferências de cookies no rodapé.</w:t>
+        <w:t>O aviso oferece Rejeitar cookies opcionais e Aceitar opcionais com destaque equivalente. Não há cookies opcionais ativos nesta versão. Guardamos a escolha e sua data neste navegador, até remoção dos dados ou atualização da versão do aviso. Você pode alterar a escolha em Preferências de cookies no rodapé.</w:t>
       </w:r>
     </w:p>
     <w:p>
@@ -879,7 +879,7 @@
       <w:pStyle w:val="Footer"/>
     </w:pPr>
     <w:r>
-      <w:t xml:space="preserve">Minuta 1.0 • 19 de outubro de 2026                                      Página </w:t>
+      <w:t xml:space="preserve">Minuta 1.1 • 19 de outubro de 2026                                      Página </w:t>
     </w:r>
     <w:fldSimple w:instr="PAGE"/>
   </w:p>

</xml_diff>